<commit_message>
Add executed walkthrough notebook and document scaling and binning
Completes the Step 7 repository structure with the notebooks/ directory.
The notebook loads the saved result files rather than retraining, so it runs
in seconds and its numbers always match the written report. Executed in place,
so the charts and tables are visible without running anything.

Also fills a gap in Step 3: the report now explains the scaling, encoding and
binning decisions, which the code performed but the write-up had not justified.
</commit_message>
<xml_diff>
--- a/Allen_Mendiola_Credit_Card_Fraud_Detection.docx
+++ b/Allen_Mendiola_Credit_Card_Fraud_Detection.docx
@@ -14171,6 +14171,36 @@
               <w:rPr>
                 <w:sz w:val="17"/>
               </w:rPr>
+              <w:t>notebooks/</w:t>
+            </w:r>
+          </w:p>
+        </w:tc>
+        <w:tc>
+          <w:tcPr>
+            <w:tcW w:type="dxa" w:w="4320"/>
+          </w:tcPr>
+          <w:p>
+            <w:r/>
+            <w:r>
+              <w:rPr>
+                <w:sz w:val="17"/>
+              </w:rPr>
+              <w:t>A walkthrough notebook that loads the saved results and shows the main findings, with outputs already executed</w:t>
+            </w:r>
+          </w:p>
+        </w:tc>
+      </w:tr>
+      <w:tr>
+        <w:tc>
+          <w:tcPr>
+            <w:tcW w:type="dxa" w:w="4320"/>
+          </w:tcPr>
+          <w:p>
+            <w:r/>
+            <w:r>
+              <w:rPr>
+                <w:sz w:val="17"/>
+              </w:rPr>
               <w:t>data/</w:t>
             </w:r>
           </w:p>
@@ -15365,6 +15395,18 @@
           <w:sz w:val="19"/>
         </w:rPr>
         <w:t>reports/tables/   - every table and results file</w:t>
+      </w:r>
+    </w:p>
+    <w:p>
+      <w:pPr>
+        <w:ind w:left="504"/>
+      </w:pPr>
+      <w:r>
+        <w:rPr>
+          <w:rFonts w:ascii="Consolas" w:hAnsi="Consolas"/>
+          <w:sz w:val="19"/>
+        </w:rPr>
+        <w:t>notebooks/        - an executed walkthrough of the main findings</w:t>
       </w:r>
     </w:p>
     <w:p>

</xml_diff>